<commit_message>
Ajuste chiquito en footer
</commit_message>
<xml_diff>
--- a/docs/Contrato_degnisDev_ManosUnidas.docx
+++ b/docs/Contrato_degnisDev_ManosUnidas.docx
@@ -4,7 +4,7 @@
   <w:body>
     <w:tbl>
       <w:tblPr>
-        <w:tblW w:w="9765" w:type="dxa"/>
+        <w:tblW w:w="10080" w:type="dxa"/>
         <w:tblBorders>
           <w:top w:val="single" w:sz="4" w:space="0" w:color="auto"/>
           <w:left w:val="single" w:sz="4" w:space="0" w:color="auto"/>
@@ -20,22 +20,17 @@
         <w:tblLook w:val="04A0" w:firstRow="1" w:lastRow="0" w:firstColumn="1" w:lastColumn="0" w:noHBand="0" w:noVBand="1"/>
       </w:tblPr>
       <w:tblGrid>
-        <w:gridCol w:w="2103"/>
-        <w:gridCol w:w="7662"/>
+        <w:gridCol w:w="2052"/>
+        <w:gridCol w:w="4874"/>
+        <w:gridCol w:w="3154"/>
       </w:tblGrid>
       <w:tr>
-        <w:tblPrEx>
-          <w:tblCellMar>
-            <w:top w:w="0" w:type="dxa"/>
-            <w:bottom w:w="0" w:type="dxa"/>
-          </w:tblCellMar>
-        </w:tblPrEx>
         <w:trPr>
           <w:trHeight w:val="1957"/>
         </w:trPr>
         <w:tc>
           <w:tcPr>
-            <w:tcW w:w="2103" w:type="dxa"/>
+            <w:tcW w:w="2052" w:type="dxa"/>
             <w:tcBorders>
               <w:top w:val="none" w:sz="0" w:space="0" w:color="FFFFFF"/>
               <w:left w:val="none" w:sz="0" w:space="0" w:color="FFFFFF"/>
@@ -119,7 +114,7 @@
         </w:tc>
         <w:tc>
           <w:tcPr>
-            <w:tcW w:w="7662" w:type="dxa"/>
+            <w:tcW w:w="4874" w:type="dxa"/>
             <w:tcBorders>
               <w:top w:val="none" w:sz="0" w:space="0" w:color="FFFFFF"/>
               <w:left w:val="none" w:sz="0" w:space="0" w:color="FFFFFF"/>
@@ -178,6 +173,31 @@
               </w:rPr>
               <w:t>Bogotá, D.C. — 14 de mayo de 2026</w:t>
             </w:r>
+          </w:p>
+        </w:tc>
+        <w:tc>
+          <w:tcPr>
+            <w:tcW w:w="3154" w:type="dxa"/>
+            <w:tcBorders>
+              <w:top w:val="none" w:sz="0" w:space="0" w:color="FFFFFF"/>
+              <w:left w:val="none" w:sz="0" w:space="0" w:color="FFFFFF"/>
+              <w:bottom w:val="none" w:sz="0" w:space="0" w:color="FFFFFF"/>
+              <w:right w:val="none" w:sz="0" w:space="0" w:color="FFFFFF"/>
+            </w:tcBorders>
+            <w:shd w:val="clear" w:color="auto" w:fill="1A1A2E"/>
+          </w:tcPr>
+          <w:p>
+            <w:pPr>
+              <w:spacing w:before="40" w:after="40"/>
+              <w:jc w:val="both"/>
+              <w:rPr>
+                <w:b/>
+                <w:bCs/>
+                <w:color w:val="FFFFFF"/>
+                <w:sz w:val="32"/>
+                <w:szCs w:val="32"/>
+              </w:rPr>
+            </w:pPr>
           </w:p>
         </w:tc>
       </w:tr>
@@ -263,12 +283,6 @@
         <w:gridCol w:w="6860"/>
       </w:tblGrid>
       <w:tr>
-        <w:tblPrEx>
-          <w:tblCellMar>
-            <w:top w:w="0" w:type="dxa"/>
-            <w:bottom w:w="0" w:type="dxa"/>
-          </w:tblCellMar>
-        </w:tblPrEx>
         <w:tc>
           <w:tcPr>
             <w:tcW w:w="2500" w:type="dxa"/>
@@ -334,12 +348,6 @@
         </w:tc>
       </w:tr>
       <w:tr>
-        <w:tblPrEx>
-          <w:tblCellMar>
-            <w:top w:w="0" w:type="dxa"/>
-            <w:bottom w:w="0" w:type="dxa"/>
-          </w:tblCellMar>
-        </w:tblPrEx>
         <w:tc>
           <w:tcPr>
             <w:tcW w:w="2500" w:type="dxa"/>
@@ -405,12 +413,6 @@
         </w:tc>
       </w:tr>
       <w:tr>
-        <w:tblPrEx>
-          <w:tblCellMar>
-            <w:top w:w="0" w:type="dxa"/>
-            <w:bottom w:w="0" w:type="dxa"/>
-          </w:tblCellMar>
-        </w:tblPrEx>
         <w:tc>
           <w:tcPr>
             <w:tcW w:w="2500" w:type="dxa"/>
@@ -476,12 +478,6 @@
         </w:tc>
       </w:tr>
       <w:tr>
-        <w:tblPrEx>
-          <w:tblCellMar>
-            <w:top w:w="0" w:type="dxa"/>
-            <w:bottom w:w="0" w:type="dxa"/>
-          </w:tblCellMar>
-        </w:tblPrEx>
         <w:tc>
           <w:tcPr>
             <w:tcW w:w="2500" w:type="dxa"/>
@@ -547,12 +543,6 @@
         </w:tc>
       </w:tr>
       <w:tr>
-        <w:tblPrEx>
-          <w:tblCellMar>
-            <w:top w:w="0" w:type="dxa"/>
-            <w:bottom w:w="0" w:type="dxa"/>
-          </w:tblCellMar>
-        </w:tblPrEx>
         <w:tc>
           <w:tcPr>
             <w:tcW w:w="2500" w:type="dxa"/>
@@ -660,12 +650,6 @@
         <w:gridCol w:w="6860"/>
       </w:tblGrid>
       <w:tr>
-        <w:tblPrEx>
-          <w:tblCellMar>
-            <w:top w:w="0" w:type="dxa"/>
-            <w:bottom w:w="0" w:type="dxa"/>
-          </w:tblCellMar>
-        </w:tblPrEx>
         <w:tc>
           <w:tcPr>
             <w:tcW w:w="2500" w:type="dxa"/>
@@ -741,12 +725,6 @@
         </w:tc>
       </w:tr>
       <w:tr>
-        <w:tblPrEx>
-          <w:tblCellMar>
-            <w:top w:w="0" w:type="dxa"/>
-            <w:bottom w:w="0" w:type="dxa"/>
-          </w:tblCellMar>
-        </w:tblPrEx>
         <w:tc>
           <w:tcPr>
             <w:tcW w:w="2500" w:type="dxa"/>
@@ -812,12 +790,6 @@
         </w:tc>
       </w:tr>
       <w:tr>
-        <w:tblPrEx>
-          <w:tblCellMar>
-            <w:top w:w="0" w:type="dxa"/>
-            <w:bottom w:w="0" w:type="dxa"/>
-          </w:tblCellMar>
-        </w:tblPrEx>
         <w:tc>
           <w:tcPr>
             <w:tcW w:w="2500" w:type="dxa"/>
@@ -883,12 +855,6 @@
         </w:tc>
       </w:tr>
       <w:tr>
-        <w:tblPrEx>
-          <w:tblCellMar>
-            <w:top w:w="0" w:type="dxa"/>
-            <w:bottom w:w="0" w:type="dxa"/>
-          </w:tblCellMar>
-        </w:tblPrEx>
         <w:tc>
           <w:tcPr>
             <w:tcW w:w="2500" w:type="dxa"/>
@@ -954,12 +920,6 @@
         </w:tc>
       </w:tr>
       <w:tr>
-        <w:tblPrEx>
-          <w:tblCellMar>
-            <w:top w:w="0" w:type="dxa"/>
-            <w:bottom w:w="0" w:type="dxa"/>
-          </w:tblCellMar>
-        </w:tblPrEx>
         <w:tc>
           <w:tcPr>
             <w:tcW w:w="2500" w:type="dxa"/>
@@ -1501,12 +1461,6 @@
         <w:gridCol w:w="7160"/>
       </w:tblGrid>
       <w:tr>
-        <w:tblPrEx>
-          <w:tblCellMar>
-            <w:top w:w="0" w:type="dxa"/>
-            <w:bottom w:w="0" w:type="dxa"/>
-          </w:tblCellMar>
-        </w:tblPrEx>
         <w:tc>
           <w:tcPr>
             <w:tcW w:w="2200" w:type="dxa"/>
@@ -1575,12 +1529,6 @@
         </w:tc>
       </w:tr>
       <w:tr>
-        <w:tblPrEx>
-          <w:tblCellMar>
-            <w:top w:w="0" w:type="dxa"/>
-            <w:bottom w:w="0" w:type="dxa"/>
-          </w:tblCellMar>
-        </w:tblPrEx>
         <w:tc>
           <w:tcPr>
             <w:tcW w:w="2200" w:type="dxa"/>
@@ -1665,12 +1613,6 @@
         </w:tc>
       </w:tr>
       <w:tr>
-        <w:tblPrEx>
-          <w:tblCellMar>
-            <w:top w:w="0" w:type="dxa"/>
-            <w:bottom w:w="0" w:type="dxa"/>
-          </w:tblCellMar>
-        </w:tblPrEx>
         <w:tc>
           <w:tcPr>
             <w:tcW w:w="2200" w:type="dxa"/>
@@ -1749,12 +1691,6 @@
         </w:tc>
       </w:tr>
       <w:tr>
-        <w:tblPrEx>
-          <w:tblCellMar>
-            <w:top w:w="0" w:type="dxa"/>
-            <w:bottom w:w="0" w:type="dxa"/>
-          </w:tblCellMar>
-        </w:tblPrEx>
         <w:tc>
           <w:tcPr>
             <w:tcW w:w="2200" w:type="dxa"/>
@@ -1823,12 +1759,6 @@
         </w:tc>
       </w:tr>
       <w:tr>
-        <w:tblPrEx>
-          <w:tblCellMar>
-            <w:top w:w="0" w:type="dxa"/>
-            <w:bottom w:w="0" w:type="dxa"/>
-          </w:tblCellMar>
-        </w:tblPrEx>
         <w:tc>
           <w:tcPr>
             <w:tcW w:w="2200" w:type="dxa"/>
@@ -1929,12 +1859,6 @@
         </w:tc>
       </w:tr>
       <w:tr>
-        <w:tblPrEx>
-          <w:tblCellMar>
-            <w:top w:w="0" w:type="dxa"/>
-            <w:bottom w:w="0" w:type="dxa"/>
-          </w:tblCellMar>
-        </w:tblPrEx>
         <w:tc>
           <w:tcPr>
             <w:tcW w:w="2200" w:type="dxa"/>
@@ -2003,12 +1927,6 @@
         </w:tc>
       </w:tr>
       <w:tr>
-        <w:tblPrEx>
-          <w:tblCellMar>
-            <w:top w:w="0" w:type="dxa"/>
-            <w:bottom w:w="0" w:type="dxa"/>
-          </w:tblCellMar>
-        </w:tblPrEx>
         <w:tc>
           <w:tcPr>
             <w:tcW w:w="2200" w:type="dxa"/>
@@ -2075,12 +1993,6 @@
         </w:tc>
       </w:tr>
       <w:tr>
-        <w:tblPrEx>
-          <w:tblCellMar>
-            <w:top w:w="0" w:type="dxa"/>
-            <w:bottom w:w="0" w:type="dxa"/>
-          </w:tblCellMar>
-        </w:tblPrEx>
         <w:tc>
           <w:tcPr>
             <w:tcW w:w="2200" w:type="dxa"/>
@@ -2353,25 +2265,7 @@
           <w:sz w:val="21"/>
           <w:szCs w:val="21"/>
         </w:rPr>
-        <w:t xml:space="preserve">30 días de soporte técnico </w:t>
-      </w:r>
-      <w:proofErr w:type="spellStart"/>
-      <w:r>
-        <w:rPr>
-          <w:color w:val="222222"/>
-          <w:sz w:val="21"/>
-          <w:szCs w:val="21"/>
-        </w:rPr>
-        <w:t>post-entrega</w:t>
-      </w:r>
-      <w:proofErr w:type="spellEnd"/>
-      <w:r>
-        <w:rPr>
-          <w:color w:val="222222"/>
-          <w:sz w:val="21"/>
-          <w:szCs w:val="21"/>
-        </w:rPr>
-        <w:t xml:space="preserve"> para corrección de errores o ajustes menores.</w:t>
+        <w:t>30 días de soporte técnico post-entrega para corrección de errores o ajustes menores.</w:t>
       </w:r>
     </w:p>
     <w:p>
@@ -2639,12 +2533,6 @@
         <w:gridCol w:w="6860"/>
       </w:tblGrid>
       <w:tr>
-        <w:tblPrEx>
-          <w:tblCellMar>
-            <w:top w:w="0" w:type="dxa"/>
-            <w:bottom w:w="0" w:type="dxa"/>
-          </w:tblCellMar>
-        </w:tblPrEx>
         <w:tc>
           <w:tcPr>
             <w:tcW w:w="2500" w:type="dxa"/>
@@ -2710,12 +2598,6 @@
         </w:tc>
       </w:tr>
       <w:tr>
-        <w:tblPrEx>
-          <w:tblCellMar>
-            <w:top w:w="0" w:type="dxa"/>
-            <w:bottom w:w="0" w:type="dxa"/>
-          </w:tblCellMar>
-        </w:tblPrEx>
         <w:tc>
           <w:tcPr>
             <w:tcW w:w="2500" w:type="dxa"/>
@@ -2781,12 +2663,6 @@
         </w:tc>
       </w:tr>
       <w:tr>
-        <w:tblPrEx>
-          <w:tblCellMar>
-            <w:top w:w="0" w:type="dxa"/>
-            <w:bottom w:w="0" w:type="dxa"/>
-          </w:tblCellMar>
-        </w:tblPrEx>
         <w:tc>
           <w:tcPr>
             <w:tcW w:w="2500" w:type="dxa"/>
@@ -2852,12 +2728,6 @@
         </w:tc>
       </w:tr>
       <w:tr>
-        <w:tblPrEx>
-          <w:tblCellMar>
-            <w:top w:w="0" w:type="dxa"/>
-            <w:bottom w:w="0" w:type="dxa"/>
-          </w:tblCellMar>
-        </w:tblPrEx>
         <w:tc>
           <w:tcPr>
             <w:tcW w:w="2500" w:type="dxa"/>
@@ -2980,12 +2850,6 @@
         <w:gridCol w:w="3120"/>
       </w:tblGrid>
       <w:tr>
-        <w:tblPrEx>
-          <w:tblCellMar>
-            <w:top w:w="0" w:type="dxa"/>
-            <w:bottom w:w="0" w:type="dxa"/>
-          </w:tblCellMar>
-        </w:tblPrEx>
         <w:tc>
           <w:tcPr>
             <w:tcW w:w="3120" w:type="dxa"/>
@@ -3087,12 +2951,6 @@
         </w:tc>
       </w:tr>
       <w:tr>
-        <w:tblPrEx>
-          <w:tblCellMar>
-            <w:top w:w="0" w:type="dxa"/>
-            <w:bottom w:w="0" w:type="dxa"/>
-          </w:tblCellMar>
-        </w:tblPrEx>
         <w:tc>
           <w:tcPr>
             <w:tcW w:w="3120" w:type="dxa"/>
@@ -3190,12 +3048,6 @@
         </w:tc>
       </w:tr>
       <w:tr>
-        <w:tblPrEx>
-          <w:tblCellMar>
-            <w:top w:w="0" w:type="dxa"/>
-            <w:bottom w:w="0" w:type="dxa"/>
-          </w:tblCellMar>
-        </w:tblPrEx>
         <w:tc>
           <w:tcPr>
             <w:tcW w:w="3120" w:type="dxa"/>
@@ -3995,12 +3847,6 @@
         <w:gridCol w:w="4560"/>
       </w:tblGrid>
       <w:tr>
-        <w:tblPrEx>
-          <w:tblCellMar>
-            <w:top w:w="0" w:type="dxa"/>
-            <w:bottom w:w="0" w:type="dxa"/>
-          </w:tblCellMar>
-        </w:tblPrEx>
         <w:tc>
           <w:tcPr>
             <w:tcW w:w="4560" w:type="dxa"/>
@@ -4288,13 +4134,59 @@
     <w:pPr>
       <w:jc w:val="center"/>
     </w:pPr>
+    <w:proofErr w:type="gramStart"/>
     <w:r>
       <w:rPr>
         <w:color w:val="555555"/>
         <w:sz w:val="18"/>
         <w:szCs w:val="18"/>
       </w:rPr>
-      <w:t xml:space="preserve">degnisDev  |  Geovany Quevedo  |  C.C. 1070958118  |  Página </w:t>
+      <w:t>degnisDev  |</w:t>
+    </w:r>
+    <w:proofErr w:type="gramEnd"/>
+    <w:r>
+      <w:rPr>
+        <w:color w:val="555555"/>
+        <w:sz w:val="18"/>
+        <w:szCs w:val="18"/>
+      </w:rPr>
+      <w:t xml:space="preserve">  Geovany </w:t>
+    </w:r>
+    <w:proofErr w:type="gramStart"/>
+    <w:r>
+      <w:rPr>
+        <w:color w:val="555555"/>
+        <w:sz w:val="18"/>
+        <w:szCs w:val="18"/>
+      </w:rPr>
+      <w:t>Quevedo  |</w:t>
+    </w:r>
+    <w:proofErr w:type="gramEnd"/>
+    <w:r>
+      <w:rPr>
+        <w:color w:val="555555"/>
+        <w:sz w:val="18"/>
+        <w:szCs w:val="18"/>
+      </w:rPr>
+      <w:t xml:space="preserve">  C.C. </w:t>
+    </w:r>
+    <w:proofErr w:type="gramStart"/>
+    <w:r>
+      <w:rPr>
+        <w:color w:val="555555"/>
+        <w:sz w:val="18"/>
+        <w:szCs w:val="18"/>
+      </w:rPr>
+      <w:t>1070958118  |</w:t>
+    </w:r>
+    <w:proofErr w:type="gramEnd"/>
+    <w:r>
+      <w:rPr>
+        <w:color w:val="555555"/>
+        <w:sz w:val="18"/>
+        <w:szCs w:val="18"/>
+      </w:rPr>
+      <w:t xml:space="preserve">  Página </w:t>
     </w:r>
     <w:r>
       <w:rPr>

</xml_diff>